<commit_message>
feat: Convex migration complete — chat, calls, media, status, settings
- Migrated entire backend from Supabase/Express to Convex
- Real-time chat with message delivery/read receipts
- Voice and video calls via Agora RTC
- Image/video sending with Convex file storage
- Auto-download setting (never/wifi/mobile) with tap-to-load UI
- Full-screen image viewer on tap
- WhatsApp-style chat input: attachment panel, Giphy sticker picker, camera
- Status posts (24h expiry), call history, SOS contacts
- Dark/light theme, font size settings, privacy controls
- Android and iOS native builds added

Co-Authored-By: Claude Sonnet 4.6 <noreply@anthropic.com>
</commit_message>
<xml_diff>
--- a/docs/business/Connex_Business_Plan.docx
+++ b/docs/business/Connex_Business_Plan.docx
@@ -13030,7 +13030,7 @@
                 <w:color w:val="000000"/>
                 <w:sz w:val="20"/>
               </w:rPr>
-              <w:t>React Navigation v6</w:t>
+              <w:t>React Navigation v7</w:t>
             </w:r>
           </w:p>
         </w:tc>
@@ -13140,7 +13140,7 @@
                 <w:color w:val="000000"/>
                 <w:sz w:val="20"/>
               </w:rPr>
-              <w:t>REST API server — hosted on Railway</w:t>
+              <w:t>Thin privileged API for SOS, push, alerts, and admin-only flows</w:t>
             </w:r>
           </w:p>
         </w:tc>
@@ -13279,7 +13279,7 @@
                 <w:color w:val="000000"/>
                 <w:sz w:val="20"/>
               </w:rPr>
-              <w:t>Supabase Auth + JWT + bcrypt</w:t>
+              <w:t>Supabase Auth + phone/password</w:t>
             </w:r>
           </w:p>
         </w:tc>
@@ -13306,7 +13306,7 @@
                 <w:color w:val="000000"/>
                 <w:sz w:val="20"/>
               </w:rPr>
-              <w:t>Phone OTP + password, secure tokens</w:t>
+              <w:t>Direct mobile sessions with backend verification for protected routes</w:t>
             </w:r>
           </w:p>
         </w:tc>
@@ -13389,7 +13389,7 @@
                 <w:color w:val="000000"/>
                 <w:sz w:val="20"/>
               </w:rPr>
-              <w:t>Live message delivery — no Socket.io</w:t>
+              <w:t>Live message delivery for active chats — no Socket.io</w:t>
             </w:r>
           </w:p>
         </w:tc>
@@ -13528,7 +13528,7 @@
                 <w:color w:val="000000"/>
                 <w:sz w:val="20"/>
               </w:rPr>
-              <w:t>Upstash Redis (serverless)</w:t>
+              <w:t>Upstash Redis (optional)</w:t>
             </w:r>
           </w:p>
         </w:tc>
@@ -13555,7 +13555,7 @@
                 <w:color w:val="000000"/>
                 <w:sz w:val="20"/>
               </w:rPr>
-              <w:t>JWT sessions, rate limiting, alert cache</w:t>
+              <w:t>Rate limiting and alert cache when enabled</w:t>
             </w:r>
           </w:p>
         </w:tc>
@@ -13694,7 +13694,7 @@
                 <w:color w:val="000000"/>
                 <w:sz w:val="20"/>
               </w:rPr>
-              <w:t>EskomSePush API (cached in Redis)</w:t>
+              <w:t>EskomSePush API (cached when enabled)</w:t>
             </w:r>
           </w:p>
         </w:tc>
@@ -13777,7 +13777,7 @@
                 <w:color w:val="000000"/>
                 <w:sz w:val="20"/>
               </w:rPr>
-              <w:t>Railway</w:t>
+              <w:t>Any Node host</w:t>
             </w:r>
           </w:p>
         </w:tc>
@@ -13804,7 +13804,7 @@
                 <w:color w:val="000000"/>
                 <w:sz w:val="20"/>
               </w:rPr>
-              <w:t>Auto-deploy from GitHub, free tier entry</w:t>
+              <w:t>Optional hosted backend once local/free-tier development is no longer enough</w:t>
             </w:r>
           </w:p>
         </w:tc>
@@ -14003,7 +14003,7 @@
           <w:color w:val="000000"/>
           <w:sz w:val="22"/>
         </w:rPr>
-        <w:t>The Connex infrastructure is designed to scale from zero to one million monthly active users without requiring a fundamental architectural change. Supabase's PostgreSQL database handles the primary data layer with Row Level Security enforced at the database level, ensuring data isolation even if application-layer security is compromised. Supabase Realtime handles WebSocket connections for live chat delivery, scaling horizontally with the Supabase infrastructure. The Express backend, hosted on Railway, scales via Railway's automatic deployment and container orchestration. Upstash Redis provides a serverless, auto-scaling cache layer for JWT sessions, rate limiting state, and the loadshedding schedule cache.</w:t>
+        <w:t>The Connex infrastructure is designed to scale from zero to one million monthly active users without requiring a fundamental architectural change. Supabase's PostgreSQL database handles the primary data layer with Row Level Security enforced at the database level, ensuring data isolation even if application-layer security is compromised. Supabase Realtime handles WebSocket connections for live chat delivery, scaling horizontally with the Supabase infrastructure. The Express backend stays thin and only handles privileged workflows such as SOS fan-out, push notification delivery, and official alert integrations. Redis remains optional and is used only for caching and rate limiting when it is available.</w:t>
       </w:r>
     </w:p>
     <w:p>
@@ -14018,7 +14018,7 @@
           <w:color w:val="000000"/>
           <w:sz w:val="22"/>
         </w:rPr>
-        <w:t>The free tier entry points of each infrastructure provider are specifically chosen to match the Phase 1 user volume projections: Supabase free tier handles up to 500MB of database storage and 2GB of file storage, sufficient for the first 50,000 users. Railway's free tier with the starter plan handles the backend API load at Phase 1 volume. Upstash Redis free tier handles 10,000 commands per day, sufficient with aggressive caching. Each service has a clear, well-documented paid upgrade path: Supabase Pro at USD 25 per month, Railway at USD 5 per month per service, Upstash Redis at USD 0.20 per 100K commands above the free limit. These costs are explicitly modelled in the financial projections and scale proportionally with revenue.</w:t>
+        <w:t>The free tier entry points of each infrastructure provider are specifically chosen to match the Phase 1 user volume projections: Supabase free tier handles up to 500MB of database storage and 2GB of file storage, sufficient for the first 50,000 users. Firebase FCM remains free for standard push volumes, and Redis can stay disabled entirely in the zero-budget phase. Paid hosting and paid third-party integrations are postponed until product traction requires them.</w:t>
       </w:r>
     </w:p>
     <w:p>
@@ -14063,7 +14063,7 @@
           <w:color w:val="0D1B2A"/>
           <w:sz w:val="22"/>
         </w:rPr>
-        <w:t xml:space="preserve">Password security. </w:t>
+        <w:t xml:space="preserve">Authentication. </w:t>
       </w:r>
       <w:r>
         <w:rPr>
@@ -14071,7 +14071,7 @@
           <w:color w:val="000000"/>
           <w:sz w:val="22"/>
         </w:rPr>
-        <w:t>All passwords are hashed with bcrypt before storage. No plain-text credentials are ever stored.</w:t>
+        <w:t>Supabase Auth is the session source of truth. The backend verifies Supabase access tokens before serving private data.</w:t>
       </w:r>
     </w:p>
     <w:p>
@@ -14087,7 +14087,7 @@
           <w:color w:val="0D1B2A"/>
           <w:sz w:val="22"/>
         </w:rPr>
-        <w:t xml:space="preserve">Authentication. </w:t>
+        <w:t xml:space="preserve">Password security. </w:t>
       </w:r>
       <w:r>
         <w:rPr>
@@ -14095,7 +14095,7 @@
           <w:color w:val="000000"/>
           <w:sz w:val="22"/>
         </w:rPr>
-        <w:t>All API endpoints are protected by JWT authentication middleware. No private data is accessible without a valid token.</w:t>
+        <w:t>Legacy bcrypt password hashes are retained only long enough to migrate older custom-auth accounts safely into Supabase Auth. No plain-text credentials are ever stored.</w:t>
       </w:r>
     </w:p>
     <w:p>
@@ -27138,7 +27138,7 @@
                 <w:color w:val="0D1B2A"/>
                 <w:sz w:val="20"/>
               </w:rPr>
-              <w:t>jsonwebtoken</w:t>
+              <w:t>bcryptjs</w:t>
             </w:r>
           </w:p>
         </w:tc>
@@ -27165,7 +27165,7 @@
                 <w:color w:val="000000"/>
                 <w:sz w:val="20"/>
               </w:rPr>
-              <w:t>^9.x</w:t>
+              <w:t>^3.x</w:t>
             </w:r>
           </w:p>
         </w:tc>
@@ -27192,7 +27192,7 @@
                 <w:color w:val="000000"/>
                 <w:sz w:val="20"/>
               </w:rPr>
-              <w:t>JWT creation and verification</w:t>
+              <w:t>Legacy-password migration support</w:t>
             </w:r>
           </w:p>
         </w:tc>
@@ -27221,7 +27221,7 @@
                 <w:color w:val="0D1B2A"/>
                 <w:sz w:val="20"/>
               </w:rPr>
-              <w:t>bcryptjs</w:t>
+              <w:t>Zod</w:t>
             </w:r>
           </w:p>
         </w:tc>
@@ -27248,7 +27248,7 @@
                 <w:color w:val="000000"/>
                 <w:sz w:val="20"/>
               </w:rPr>
-              <w:t>^2.x</w:t>
+              <w:t>^3.x</w:t>
             </w:r>
           </w:p>
         </w:tc>
@@ -27275,7 +27275,7 @@
                 <w:color w:val="000000"/>
                 <w:sz w:val="20"/>
               </w:rPr>
-              <w:t>Password hashing</w:t>
+              <w:t>Request body validation</w:t>
             </w:r>
           </w:p>
         </w:tc>
@@ -27304,7 +27304,7 @@
                 <w:color w:val="0D1B2A"/>
                 <w:sz w:val="20"/>
               </w:rPr>
-              <w:t>Zod</w:t>
+              <w:t>ioredis</w:t>
             </w:r>
           </w:p>
         </w:tc>
@@ -27331,7 +27331,7 @@
                 <w:color w:val="000000"/>
                 <w:sz w:val="20"/>
               </w:rPr>
-              <w:t>^3.x</w:t>
+              <w:t>^5.x</w:t>
             </w:r>
           </w:p>
         </w:tc>
@@ -27358,7 +27358,7 @@
                 <w:color w:val="000000"/>
                 <w:sz w:val="20"/>
               </w:rPr>
-              <w:t>Request body validation</w:t>
+              <w:t>Upstash Redis client</w:t>
             </w:r>
           </w:p>
         </w:tc>
@@ -27387,7 +27387,7 @@
                 <w:color w:val="0D1B2A"/>
                 <w:sz w:val="20"/>
               </w:rPr>
-              <w:t>ioredis</w:t>
+              <w:t>node-cron</w:t>
             </w:r>
           </w:p>
         </w:tc>
@@ -27414,7 +27414,7 @@
                 <w:color w:val="000000"/>
                 <w:sz w:val="20"/>
               </w:rPr>
-              <w:t>^5.x</w:t>
+              <w:t>^3.x</w:t>
             </w:r>
           </w:p>
         </w:tc>
@@ -27441,7 +27441,7 @@
                 <w:color w:val="000000"/>
                 <w:sz w:val="20"/>
               </w:rPr>
-              <w:t>Upstash Redis client</w:t>
+              <w:t>Scheduled jobs — loadshedding data refresh</w:t>
             </w:r>
           </w:p>
         </w:tc>
@@ -27470,7 +27470,7 @@
                 <w:color w:val="0D1B2A"/>
                 <w:sz w:val="20"/>
               </w:rPr>
-              <w:t>node-cron</w:t>
+              <w:t>axios</w:t>
             </w:r>
           </w:p>
         </w:tc>
@@ -27497,7 +27497,7 @@
                 <w:color w:val="000000"/>
                 <w:sz w:val="20"/>
               </w:rPr>
-              <w:t>^3.x</w:t>
+              <w:t>^1.x</w:t>
             </w:r>
           </w:p>
         </w:tc>
@@ -27524,7 +27524,7 @@
                 <w:color w:val="000000"/>
                 <w:sz w:val="20"/>
               </w:rPr>
-              <w:t>Scheduled jobs — loadshedding data refresh</w:t>
+              <w:t>HTTP client for EskomSePush API</w:t>
             </w:r>
           </w:p>
         </w:tc>
@@ -27553,7 +27553,7 @@
                 <w:color w:val="0D1B2A"/>
                 <w:sz w:val="20"/>
               </w:rPr>
-              <w:t>axios</w:t>
+              <w:t>cors</w:t>
             </w:r>
           </w:p>
         </w:tc>
@@ -27580,7 +27580,7 @@
                 <w:color w:val="000000"/>
                 <w:sz w:val="20"/>
               </w:rPr>
-              <w:t>^1.x</w:t>
+              <w:t>^2.x</w:t>
             </w:r>
           </w:p>
         </w:tc>
@@ -27607,7 +27607,7 @@
                 <w:color w:val="000000"/>
                 <w:sz w:val="20"/>
               </w:rPr>
-              <w:t>HTTP client for EskomSePush API</w:t>
+              <w:t>CORS middleware</w:t>
             </w:r>
           </w:p>
         </w:tc>
@@ -27636,7 +27636,7 @@
                 <w:color w:val="0D1B2A"/>
                 <w:sz w:val="20"/>
               </w:rPr>
-              <w:t>cors</w:t>
+              <w:t>helmet</w:t>
             </w:r>
           </w:p>
         </w:tc>
@@ -27663,7 +27663,7 @@
                 <w:color w:val="000000"/>
                 <w:sz w:val="20"/>
               </w:rPr>
-              <w:t>^2.x</w:t>
+              <w:t>^8.x</w:t>
             </w:r>
           </w:p>
         </w:tc>
@@ -27690,7 +27690,7 @@
                 <w:color w:val="000000"/>
                 <w:sz w:val="20"/>
               </w:rPr>
-              <w:t>CORS middleware</w:t>
+              <w:t>Security headers</w:t>
             </w:r>
           </w:p>
         </w:tc>
@@ -27719,7 +27719,7 @@
                 <w:color w:val="0D1B2A"/>
                 <w:sz w:val="20"/>
               </w:rPr>
-              <w:t>helmet</w:t>
+              <w:t>express-rate-limit</w:t>
             </w:r>
           </w:p>
         </w:tc>
@@ -27746,7 +27746,7 @@
                 <w:color w:val="000000"/>
                 <w:sz w:val="20"/>
               </w:rPr>
-              <w:t>^8.x</w:t>
+              <w:t>^7.x</w:t>
             </w:r>
           </w:p>
         </w:tc>
@@ -27773,7 +27773,7 @@
                 <w:color w:val="000000"/>
                 <w:sz w:val="20"/>
               </w:rPr>
-              <w:t>Security headers</w:t>
+              <w:t>Rate limiting — auth endpoints</w:t>
             </w:r>
           </w:p>
         </w:tc>
@@ -27802,7 +27802,7 @@
                 <w:color w:val="0D1B2A"/>
                 <w:sz w:val="20"/>
               </w:rPr>
-              <w:t>express-rate-limit</w:t>
+              <w:t>firebase-admin</w:t>
             </w:r>
           </w:p>
         </w:tc>
@@ -27829,7 +27829,7 @@
                 <w:color w:val="000000"/>
                 <w:sz w:val="20"/>
               </w:rPr>
-              <w:t>^7.x</w:t>
+              <w:t>^12.x</w:t>
             </w:r>
           </w:p>
         </w:tc>
@@ -27856,7 +27856,7 @@
                 <w:color w:val="000000"/>
                 <w:sz w:val="20"/>
               </w:rPr>
-              <w:t>Rate limiting — auth endpoints</w:t>
+              <w:t>Send FCM push notifications</w:t>
             </w:r>
           </w:p>
         </w:tc>
@@ -27885,7 +27885,7 @@
                 <w:color w:val="0D1B2A"/>
                 <w:sz w:val="20"/>
               </w:rPr>
-              <w:t>firebase-admin</w:t>
+              <w:t>dotenv</w:t>
             </w:r>
           </w:p>
         </w:tc>
@@ -27912,7 +27912,7 @@
                 <w:color w:val="000000"/>
                 <w:sz w:val="20"/>
               </w:rPr>
-              <w:t>^12.x</w:t>
+              <w:t>^16.x</w:t>
             </w:r>
           </w:p>
         </w:tc>
@@ -27920,89 +27920,6 @@
           <w:tcPr>
             <w:tcW w:type="dxa" w:w="4320"/>
             <w:shd w:val="clear" w:color="auto" w:fill="F2F4F7"/>
-            <w:tcBorders>
-              <w:top w:val="single" w:sz="4" w:space="0" w:color="D0D5DD"/>
-              <w:left w:val="single" w:sz="4" w:space="0" w:color="D0D5DD"/>
-              <w:bottom w:val="single" w:sz="4" w:space="0" w:color="D0D5DD"/>
-              <w:right w:val="single" w:sz="4" w:space="0" w:color="D0D5DD"/>
-            </w:tcBorders>
-            <w:vAlign w:val="center"/>
-          </w:tcPr>
-          <w:p>
-            <w:pPr>
-              <w:jc w:val="left"/>
-            </w:pPr>
-            <w:r>
-              <w:rPr>
-                <w:rFonts w:ascii="Garamond" w:hAnsi="Garamond"/>
-                <w:b w:val="0"/>
-                <w:color w:val="000000"/>
-                <w:sz w:val="20"/>
-              </w:rPr>
-              <w:t>Send FCM push notifications</w:t>
-            </w:r>
-          </w:p>
-        </w:tc>
-      </w:tr>
-      <w:tr>
-        <w:tc>
-          <w:tcPr>
-            <w:tcW w:type="dxa" w:w="3456"/>
-            <w:shd w:val="clear" w:color="auto" w:fill="FFFFFF"/>
-            <w:tcBorders>
-              <w:top w:val="single" w:sz="4" w:space="0" w:color="D0D5DD"/>
-              <w:left w:val="single" w:sz="4" w:space="0" w:color="D0D5DD"/>
-              <w:bottom w:val="single" w:sz="4" w:space="0" w:color="D0D5DD"/>
-              <w:right w:val="single" w:sz="4" w:space="0" w:color="D0D5DD"/>
-            </w:tcBorders>
-            <w:vAlign w:val="center"/>
-          </w:tcPr>
-          <w:p>
-            <w:pPr>
-              <w:jc w:val="left"/>
-            </w:pPr>
-            <w:r>
-              <w:rPr>
-                <w:rFonts w:ascii="Garamond" w:hAnsi="Garamond"/>
-                <w:b/>
-                <w:color w:val="0D1B2A"/>
-                <w:sz w:val="20"/>
-              </w:rPr>
-              <w:t>dotenv</w:t>
-            </w:r>
-          </w:p>
-        </w:tc>
-        <w:tc>
-          <w:tcPr>
-            <w:tcW w:type="dxa" w:w="1296"/>
-            <w:shd w:val="clear" w:color="auto" w:fill="FFFFFF"/>
-            <w:tcBorders>
-              <w:top w:val="single" w:sz="4" w:space="0" w:color="D0D5DD"/>
-              <w:left w:val="single" w:sz="4" w:space="0" w:color="D0D5DD"/>
-              <w:bottom w:val="single" w:sz="4" w:space="0" w:color="D0D5DD"/>
-              <w:right w:val="single" w:sz="4" w:space="0" w:color="D0D5DD"/>
-            </w:tcBorders>
-            <w:vAlign w:val="center"/>
-          </w:tcPr>
-          <w:p>
-            <w:pPr>
-              <w:jc w:val="left"/>
-            </w:pPr>
-            <w:r>
-              <w:rPr>
-                <w:rFonts w:ascii="Garamond" w:hAnsi="Garamond"/>
-                <w:b w:val="0"/>
-                <w:color w:val="000000"/>
-                <w:sz w:val="20"/>
-              </w:rPr>
-              <w:t>^16.x</w:t>
-            </w:r>
-          </w:p>
-        </w:tc>
-        <w:tc>
-          <w:tcPr>
-            <w:tcW w:type="dxa" w:w="4320"/>
-            <w:shd w:val="clear" w:color="auto" w:fill="FFFFFF"/>
             <w:tcBorders>
               <w:top w:val="single" w:sz="4" w:space="0" w:color="D0D5DD"/>
               <w:left w:val="single" w:sz="4" w:space="0" w:color="D0D5DD"/>
@@ -28374,7 +28291,7 @@
                 <w:color w:val="000000"/>
                 <w:sz w:val="20"/>
               </w:rPr>
-              <w:t>JWT sessions, rate limiting, loadshedding cache</w:t>
+              <w:t>Optional cache, rate limiting, loadshedding cache</w:t>
             </w:r>
           </w:p>
         </w:tc>

</xml_diff>